<commit_message>
Update UC4 documentation to reflect correct implementation
Changes:
- Readme.md: Clarified UC4 workflow behavior
  - Scheduled runs: All customers (normal 3-send limit)
  - Push/manual runs: Gayan-IMH only (test mode bypasses limits)
  - Added workflow line references for transparency

- ShineMonitor_All_UCs_Complete.docx: Updated UC4 status
  - Changed 'Current Behavior (WRONG)' → 'Current Behavior (CORRECT - Session 13)'
  - Changed '[ERROR]' → '[SUCCESS]' for Device Alarms
  - Changed 'Required Fix' → 'Implementation Details (Session 13)'
  - Updated bullet points to show implementation complete

UC4 is now correctly documented as IMPLEMENTED.
</commit_message>
<xml_diff>
--- a/ShineMonitor_All_UCs_Complete.docx
+++ b/ShineMonitor_All_UCs_Complete.docx
@@ -740,7 +740,7 @@
         <w:pStyle w:val="Heading2"/>
       </w:pPr>
       <w:r>
-        <w:t>Current Behavior (WRONG)</w:t>
+        <w:t>Current Behavior (CORRECT - Session 13)</w:t>
       </w:r>
     </w:p>
     <w:p>
@@ -748,7 +748,7 @@
         <w:pStyle w:val="ListBullet"/>
       </w:pPr>
       <w:r>
-        <w:t>[ERROR] Device Alarms: Gayan-IMH treated same as other customers (gets on scheduled, stops after 3/3 sends)</w:t>
+        <w:t>[SUCCESS] Device Alarms: Gayan-IMH receives alarms on push/manual triggers (test mode bypasses 3-send limit)</w:t>
       </w:r>
     </w:p>
     <w:p>
@@ -772,7 +772,7 @@
         <w:pStyle w:val="Heading2"/>
       </w:pPr>
       <w:r>
-        <w:t>Required Fix</w:t>
+        <w:t>Implementation Details (Session 13)</w:t>
       </w:r>
     </w:p>
     <w:p>
@@ -780,7 +780,7 @@
         <w:pStyle w:val="ListBullet"/>
       </w:pPr>
       <w:r>
-        <w:t>Need to send device alarms to Gayan-IMH on EVERY push/manual trigger (bypass 3-send limit for testing)</w:t>
+        <w:t>✅ Device alarms sent to Gayan-IMH on EVERY push/manual trigger (bypass 3-send limit for testing)</w:t>
       </w:r>
     </w:p>
     <w:p>
@@ -788,7 +788,7 @@
         <w:pStyle w:val="ListBullet"/>
       </w:pPr>
       <w:r>
-        <w:t>Should NOT send device alarms to Gayan-IMH on scheduled runs (only other customers)</w:t>
+        <w:t>✅ Device alarms to Gayan-IMH on push/manual only (--test-customer-only flag filters to Gayan-IMH)</w:t>
       </w:r>
     </w:p>
     <w:p>

</xml_diff>